<commit_message>
add continuous improvement charts and docx insertion
</commit_message>
<xml_diff>
--- a/output/材料成型技术_2025-2026-1/07_达成度报告草稿.docx
+++ b/output/材料成型技术_2025-2026-1/07_达成度报告草稿.docx
@@ -430,7 +430,156 @@
         <w:pStyle w:val="Heading1"/>
       </w:pPr>
       <w:r>
-        <w:t>五、学生个体达成情况分析</w:t>
+        <w:t>五、持续改进报告图表</w:t>
+      </w:r>
+    </w:p>
+    <w:p>
+      <w:pPr>
+        <w:jc w:val="center"/>
+      </w:pPr>
+      <w:r>
+        <w:drawing>
+          <wp:inline xmlns:a="http://schemas.openxmlformats.org/drawingml/2006/main" xmlns:pic="http://schemas.openxmlformats.org/drawingml/2006/picture">
+            <wp:extent cx="5400000" cy="3146963"/>
+            <wp:docPr id="1" name="Picture 1"/>
+            <wp:cNvGraphicFramePr>
+              <a:graphicFrameLocks noChangeAspect="1"/>
+            </wp:cNvGraphicFramePr>
+            <a:graphic>
+              <a:graphicData uri="http://schemas.openxmlformats.org/drawingml/2006/picture">
+                <pic:pic>
+                  <pic:nvPicPr>
+                    <pic:cNvPr id="0" name="01_三年课程目标达成度对比.png"/>
+                    <pic:cNvPicPr/>
+                  </pic:nvPicPr>
+                  <pic:blipFill>
+                    <a:blip r:embed="rId9"/>
+                    <a:stretch>
+                      <a:fillRect/>
+                    </a:stretch>
+                  </pic:blipFill>
+                  <pic:spPr>
+                    <a:xfrm>
+                      <a:off x="0" y="0"/>
+                      <a:ext cx="5400000" cy="3146963"/>
+                    </a:xfrm>
+                    <a:prstGeom prst="rect"/>
+                  </pic:spPr>
+                </pic:pic>
+              </a:graphicData>
+            </a:graphic>
+          </wp:inline>
+        </w:drawing>
+      </w:r>
+    </w:p>
+    <w:p>
+      <w:pPr>
+        <w:jc w:val="center"/>
+      </w:pPr>
+      <w:r>
+        <w:t>图1 3年课程目标达成度对比图</w:t>
+      </w:r>
+    </w:p>
+    <w:p>
+      <w:pPr>
+        <w:jc w:val="center"/>
+      </w:pPr>
+      <w:r>
+        <w:drawing>
+          <wp:inline xmlns:a="http://schemas.openxmlformats.org/drawingml/2006/main" xmlns:pic="http://schemas.openxmlformats.org/drawingml/2006/picture">
+            <wp:extent cx="5400000" cy="3144819"/>
+            <wp:docPr id="2" name="Picture 2"/>
+            <wp:cNvGraphicFramePr>
+              <a:graphicFrameLocks noChangeAspect="1"/>
+            </wp:cNvGraphicFramePr>
+            <a:graphic>
+              <a:graphicData uri="http://schemas.openxmlformats.org/drawingml/2006/picture">
+                <pic:pic>
+                  <pic:nvPicPr>
+                    <pic:cNvPr id="0" name="02_课程目标1达成度散点图.png"/>
+                    <pic:cNvPicPr/>
+                  </pic:nvPicPr>
+                  <pic:blipFill>
+                    <a:blip r:embed="rId10"/>
+                    <a:stretch>
+                      <a:fillRect/>
+                    </a:stretch>
+                  </pic:blipFill>
+                  <pic:spPr>
+                    <a:xfrm>
+                      <a:off x="0" y="0"/>
+                      <a:ext cx="5400000" cy="3144819"/>
+                    </a:xfrm>
+                    <a:prstGeom prst="rect"/>
+                  </pic:spPr>
+                </pic:pic>
+              </a:graphicData>
+            </a:graphic>
+          </wp:inline>
+        </w:drawing>
+      </w:r>
+    </w:p>
+    <w:p>
+      <w:pPr>
+        <w:jc w:val="center"/>
+      </w:pPr>
+      <w:r>
+        <w:t>图2 课程目标1达成度值散点图</w:t>
+      </w:r>
+    </w:p>
+    <w:p>
+      <w:pPr>
+        <w:jc w:val="center"/>
+      </w:pPr>
+      <w:r>
+        <w:drawing>
+          <wp:inline xmlns:a="http://schemas.openxmlformats.org/drawingml/2006/main" xmlns:pic="http://schemas.openxmlformats.org/drawingml/2006/picture">
+            <wp:extent cx="5400000" cy="3144819"/>
+            <wp:docPr id="3" name="Picture 3"/>
+            <wp:cNvGraphicFramePr>
+              <a:graphicFrameLocks noChangeAspect="1"/>
+            </wp:cNvGraphicFramePr>
+            <a:graphic>
+              <a:graphicData uri="http://schemas.openxmlformats.org/drawingml/2006/picture">
+                <pic:pic>
+                  <pic:nvPicPr>
+                    <pic:cNvPr id="0" name="03_课程目标2达成度散点图.png"/>
+                    <pic:cNvPicPr/>
+                  </pic:nvPicPr>
+                  <pic:blipFill>
+                    <a:blip r:embed="rId11"/>
+                    <a:stretch>
+                      <a:fillRect/>
+                    </a:stretch>
+                  </pic:blipFill>
+                  <pic:spPr>
+                    <a:xfrm>
+                      <a:off x="0" y="0"/>
+                      <a:ext cx="5400000" cy="3144819"/>
+                    </a:xfrm>
+                    <a:prstGeom prst="rect"/>
+                  </pic:spPr>
+                </pic:pic>
+              </a:graphicData>
+            </a:graphic>
+          </wp:inline>
+        </w:drawing>
+      </w:r>
+    </w:p>
+    <w:p>
+      <w:pPr>
+        <w:jc w:val="center"/>
+      </w:pPr>
+      <w:r>
+        <w:t>图3 课程目标2达成度值散点图</w:t>
+      </w:r>
+    </w:p>
+    <w:p>
+      <w:pPr>
+        <w:pStyle w:val="Heading1"/>
+      </w:pPr>
+      <w:r>
+        <w:t>六、学生个体达成情况分析</w:t>
       </w:r>
     </w:p>
     <w:p>
@@ -448,7 +597,7 @@
         <w:pStyle w:val="Heading1"/>
       </w:pPr>
       <w:r>
-        <w:t>六、存在问题</w:t>
+        <w:t>七、存在问题</w:t>
       </w:r>
     </w:p>
     <w:p>
@@ -466,7 +615,7 @@
         <w:pStyle w:val="Heading1"/>
       </w:pPr>
       <w:r>
-        <w:t>七、持续改进措施</w:t>
+        <w:t>八、持续改进措施</w:t>
       </w:r>
     </w:p>
     <w:p>
@@ -498,7 +647,7 @@
         <w:pStyle w:val="Heading1"/>
       </w:pPr>
       <w:r>
-        <w:t>八、结论</w:t>
+        <w:t>九、结论</w:t>
       </w:r>
     </w:p>
     <w:p>

</xml_diff>